<commit_message>
Se actualiza la sesion de calendario 02/10/2025
</commit_message>
<xml_diff>
--- a/Manual_Git_Corto.docx
+++ b/Manual_Git_Corto.docx
@@ -22,6 +22,11 @@
       <w:r>
         <w:br/>
         <w:t>cd /c/appTurnos</w:t>
+      </w:r>
+    </w:p>
+    <w:p>
+      <w:r>
+        <w:t>git config --global core.autocrlf true</w:t>
       </w:r>
       <w:r>
         <w:br/>

</xml_diff>